<commit_message>
mise a jour cdc
</commit_message>
<xml_diff>
--- a/Documentations/cahier_des_charges.docx
+++ b/Documentations/cahier_des_charges.docx
@@ -691,11 +691,1638 @@
         <w:t>Spécification technique</w:t>
       </w:r>
     </w:p>
+    <w:p>
+      <w:pPr>
+        <w:pStyle w:val="Sous-titre"/>
+        <w:rPr>
+          <w:sz w:val="36"/>
+          <w:szCs w:val="36"/>
+        </w:rPr>
+      </w:pPr>
+      <w:r>
+        <w:rPr>
+          <w:sz w:val="36"/>
+          <w:szCs w:val="36"/>
+        </w:rPr>
+        <w:t xml:space="preserve">1. </w:t>
+      </w:r>
+      <w:r>
+        <w:rPr>
+          <w:sz w:val="36"/>
+          <w:szCs w:val="36"/>
+        </w:rPr>
+        <w:t>Langage de programmation</w:t>
+      </w:r>
+    </w:p>
+    <w:p>
+      <w:pPr>
+        <w:rPr>
+          <w:sz w:val="28"/>
+          <w:szCs w:val="28"/>
+        </w:rPr>
+      </w:pPr>
+      <w:r>
+        <w:rPr>
+          <w:sz w:val="28"/>
+          <w:szCs w:val="28"/>
+        </w:rPr>
+        <w:t xml:space="preserve">Le projet sera développé en </w:t>
+      </w:r>
+      <w:r>
+        <w:rPr>
+          <w:rStyle w:val="lev"/>
+          <w:sz w:val="28"/>
+          <w:szCs w:val="28"/>
+        </w:rPr>
+        <w:t>Python 3.14</w:t>
+      </w:r>
+      <w:r>
+        <w:rPr>
+          <w:sz w:val="28"/>
+          <w:szCs w:val="28"/>
+        </w:rPr>
+        <w:t>, qui sera utilisé pour l'ensemble des applications composant le système.</w:t>
+      </w:r>
+    </w:p>
+    <w:p>
+      <w:pPr>
+        <w:pStyle w:val="Sous-titre"/>
+        <w:rPr>
+          <w:sz w:val="36"/>
+          <w:szCs w:val="36"/>
+        </w:rPr>
+      </w:pPr>
+      <w:r>
+        <w:rPr>
+          <w:sz w:val="36"/>
+          <w:szCs w:val="36"/>
+        </w:rPr>
+        <w:t>2. Architecture du projet</w:t>
+      </w:r>
+    </w:p>
+    <w:p>
+      <w:pPr>
+        <w:rPr>
+          <w:sz w:val="28"/>
+          <w:szCs w:val="28"/>
+        </w:rPr>
+      </w:pPr>
+      <w:r>
+        <w:rPr>
+          <w:sz w:val="28"/>
+          <w:szCs w:val="28"/>
+        </w:rPr>
+        <w:t xml:space="preserve">L’architecture du projet reposera sur une communication client-serveur. Elle sera </w:t>
+      </w:r>
+      <w:r>
+        <w:rPr>
+          <w:sz w:val="28"/>
+          <w:szCs w:val="28"/>
+        </w:rPr>
+        <w:t>composée</w:t>
+      </w:r>
+      <w:r>
+        <w:rPr>
+          <w:sz w:val="28"/>
+          <w:szCs w:val="28"/>
+        </w:rPr>
+        <w:t xml:space="preserve"> de la manière suivante</w:t>
+      </w:r>
+      <w:r>
+        <w:rPr>
+          <w:sz w:val="28"/>
+          <w:szCs w:val="28"/>
+        </w:rPr>
+        <w:t xml:space="preserve"> : </w:t>
+      </w:r>
+    </w:p>
+    <w:p>
+      <w:pPr>
+        <w:pStyle w:val="Paragraphedeliste"/>
+        <w:numPr>
+          <w:ilvl w:val="0"/>
+          <w:numId w:val="8"/>
+        </w:numPr>
+        <w:rPr>
+          <w:sz w:val="28"/>
+          <w:szCs w:val="28"/>
+        </w:rPr>
+      </w:pPr>
+      <w:r>
+        <w:rPr>
+          <w:sz w:val="28"/>
+          <w:szCs w:val="28"/>
+        </w:rPr>
+        <w:t>Un serveur, chargé de gérer les connexions, de centraliser les informations et de transmettre les commandes aux clients</w:t>
+      </w:r>
+    </w:p>
+    <w:p>
+      <w:pPr>
+        <w:pStyle w:val="Paragraphedeliste"/>
+        <w:numPr>
+          <w:ilvl w:val="0"/>
+          <w:numId w:val="8"/>
+        </w:numPr>
+        <w:rPr>
+          <w:sz w:val="28"/>
+          <w:szCs w:val="28"/>
+        </w:rPr>
+      </w:pPr>
+      <w:r>
+        <w:rPr>
+          <w:sz w:val="28"/>
+          <w:szCs w:val="28"/>
+        </w:rPr>
+        <w:t>Un client représentant le carrefour, chargé de gérer et de simuler le fonctionnement d’un feu de circulation.</w:t>
+      </w:r>
+    </w:p>
+    <w:p>
+      <w:pPr>
+        <w:pStyle w:val="Paragraphedeliste"/>
+        <w:numPr>
+          <w:ilvl w:val="0"/>
+          <w:numId w:val="8"/>
+        </w:numPr>
+        <w:rPr>
+          <w:sz w:val="28"/>
+          <w:szCs w:val="28"/>
+        </w:rPr>
+      </w:pPr>
+      <w:r>
+        <w:rPr>
+          <w:sz w:val="28"/>
+          <w:szCs w:val="28"/>
+        </w:rPr>
+        <w:t xml:space="preserve">Un client représentant un véhicule d’urgence, permettant de signaler une situation d’urgence et de demander une priorité au niveau de carrefour. </w:t>
+      </w:r>
+    </w:p>
+    <w:p>
+      <w:pPr>
+        <w:pStyle w:val="Paragraphedeliste"/>
+        <w:numPr>
+          <w:ilvl w:val="0"/>
+          <w:numId w:val="8"/>
+        </w:numPr>
+        <w:rPr>
+          <w:sz w:val="28"/>
+          <w:szCs w:val="28"/>
+        </w:rPr>
+      </w:pPr>
+      <w:r>
+        <w:rPr>
+          <w:sz w:val="28"/>
+          <w:szCs w:val="28"/>
+        </w:rPr>
+        <w:t xml:space="preserve">Un client représentant les véhicules des usagers, permettant de simuler le </w:t>
+      </w:r>
+      <w:proofErr w:type="spellStart"/>
+      <w:r>
+        <w:rPr>
+          <w:sz w:val="28"/>
+          <w:szCs w:val="28"/>
+        </w:rPr>
+        <w:t>traffic</w:t>
+      </w:r>
+      <w:proofErr w:type="spellEnd"/>
+      <w:r>
+        <w:rPr>
+          <w:sz w:val="28"/>
+          <w:szCs w:val="28"/>
+        </w:rPr>
+        <w:t xml:space="preserve"> routier. Cette partie sera effectué si le temps le permet, la priorité est affectée aux trois premières parties.</w:t>
+      </w:r>
+    </w:p>
+    <w:p>
+      <w:pPr>
+        <w:rPr>
+          <w:sz w:val="28"/>
+          <w:szCs w:val="28"/>
+        </w:rPr>
+      </w:pPr>
+    </w:p>
+    <w:p>
+      <w:pPr>
+        <w:pStyle w:val="Sous-titre"/>
+        <w:rPr>
+          <w:sz w:val="36"/>
+          <w:szCs w:val="36"/>
+        </w:rPr>
+      </w:pPr>
+      <w:r>
+        <w:rPr>
+          <w:sz w:val="36"/>
+          <w:szCs w:val="36"/>
+        </w:rPr>
+        <w:t>3</w:t>
+      </w:r>
+      <w:r>
+        <w:rPr>
+          <w:sz w:val="36"/>
+          <w:szCs w:val="36"/>
+        </w:rPr>
+        <w:t xml:space="preserve">. </w:t>
+      </w:r>
+      <w:proofErr w:type="spellStart"/>
+      <w:r>
+        <w:rPr>
+          <w:sz w:val="36"/>
+          <w:szCs w:val="36"/>
+        </w:rPr>
+        <w:t>Frameworks</w:t>
+      </w:r>
+      <w:proofErr w:type="spellEnd"/>
+      <w:r>
+        <w:rPr>
+          <w:sz w:val="36"/>
+          <w:szCs w:val="36"/>
+        </w:rPr>
+        <w:t xml:space="preserve"> et bibliothèques</w:t>
+      </w:r>
+    </w:p>
+    <w:p>
+      <w:pPr>
+        <w:rPr>
+          <w:sz w:val="28"/>
+          <w:szCs w:val="28"/>
+        </w:rPr>
+      </w:pPr>
+      <w:r>
+        <w:rPr>
+          <w:sz w:val="28"/>
+          <w:szCs w:val="28"/>
+        </w:rPr>
+        <w:t>Les principales librairies utilisées sont :</w:t>
+      </w:r>
+    </w:p>
+    <w:p>
+      <w:pPr>
+        <w:pStyle w:val="Paragraphedeliste"/>
+        <w:numPr>
+          <w:ilvl w:val="0"/>
+          <w:numId w:val="8"/>
+        </w:numPr>
+      </w:pPr>
+      <w:r>
+        <w:rPr>
+          <w:sz w:val="28"/>
+          <w:szCs w:val="28"/>
+        </w:rPr>
+        <w:t>Thread, pour la gestion du multithreading.</w:t>
+      </w:r>
+    </w:p>
+    <w:p>
+      <w:pPr>
+        <w:pStyle w:val="Paragraphedeliste"/>
+        <w:numPr>
+          <w:ilvl w:val="0"/>
+          <w:numId w:val="8"/>
+        </w:numPr>
+      </w:pPr>
+      <w:r>
+        <w:rPr>
+          <w:sz w:val="28"/>
+          <w:szCs w:val="28"/>
+        </w:rPr>
+        <w:t>Socket, pour la gestion des paquets réseaux.</w:t>
+      </w:r>
+    </w:p>
+    <w:p>
+      <w:pPr>
+        <w:pStyle w:val="Paragraphedeliste"/>
+        <w:numPr>
+          <w:ilvl w:val="0"/>
+          <w:numId w:val="8"/>
+        </w:numPr>
+      </w:pPr>
+      <w:r>
+        <w:rPr>
+          <w:sz w:val="28"/>
+          <w:szCs w:val="28"/>
+        </w:rPr>
+        <w:t>PyQT5, pour la gestion des interfaces graphiques.</w:t>
+      </w:r>
+    </w:p>
+    <w:p>
+      <w:pPr>
+        <w:rPr>
+          <w:sz w:val="28"/>
+          <w:szCs w:val="28"/>
+        </w:rPr>
+      </w:pPr>
+      <w:r>
+        <w:rPr>
+          <w:sz w:val="28"/>
+          <w:szCs w:val="28"/>
+        </w:rPr>
+        <w:t>Cette liste pourra évoluer au cours du développement du projet en fonction des besoins.</w:t>
+      </w:r>
+    </w:p>
+    <w:p>
+      <w:r>
+        <w:br w:type="page"/>
+      </w:r>
+    </w:p>
+    <w:p>
+      <w:pPr>
+        <w:pStyle w:val="Sous-titre"/>
+        <w:rPr>
+          <w:sz w:val="36"/>
+          <w:szCs w:val="36"/>
+        </w:rPr>
+      </w:pPr>
+      <w:r>
+        <w:rPr>
+          <w:sz w:val="36"/>
+          <w:szCs w:val="36"/>
+        </w:rPr>
+        <w:lastRenderedPageBreak/>
+        <w:t xml:space="preserve">3. </w:t>
+      </w:r>
+      <w:r>
+        <w:rPr>
+          <w:sz w:val="36"/>
+          <w:szCs w:val="36"/>
+        </w:rPr>
+        <w:t>Environnement de développement</w:t>
+      </w:r>
+    </w:p>
+    <w:p>
+      <w:pPr>
+        <w:rPr>
+          <w:sz w:val="28"/>
+          <w:szCs w:val="28"/>
+        </w:rPr>
+      </w:pPr>
+      <w:r>
+        <w:rPr>
+          <w:sz w:val="28"/>
+          <w:szCs w:val="28"/>
+        </w:rPr>
+        <w:t xml:space="preserve">Le développement du projet sera réalisé sur </w:t>
+      </w:r>
+      <w:proofErr w:type="spellStart"/>
+      <w:r>
+        <w:rPr>
+          <w:sz w:val="28"/>
+          <w:szCs w:val="28"/>
+        </w:rPr>
+        <w:t>PyCharm</w:t>
+      </w:r>
+      <w:proofErr w:type="spellEnd"/>
+      <w:r>
+        <w:rPr>
+          <w:sz w:val="28"/>
+          <w:szCs w:val="28"/>
+        </w:rPr>
+        <w:t xml:space="preserve"> ou Visual Studio Code.</w:t>
+      </w:r>
+    </w:p>
+    <w:p>
+      <w:pPr>
+        <w:rPr>
+          <w:sz w:val="28"/>
+          <w:szCs w:val="28"/>
+        </w:rPr>
+      </w:pPr>
+      <w:r>
+        <w:rPr>
+          <w:sz w:val="28"/>
+          <w:szCs w:val="28"/>
+        </w:rPr>
+        <w:t>Un environnement virtuel « </w:t>
+      </w:r>
+      <w:proofErr w:type="spellStart"/>
+      <w:r>
+        <w:rPr>
+          <w:sz w:val="28"/>
+          <w:szCs w:val="28"/>
+        </w:rPr>
+        <w:t>venv</w:t>
+      </w:r>
+      <w:proofErr w:type="spellEnd"/>
+      <w:r>
+        <w:rPr>
+          <w:sz w:val="28"/>
+          <w:szCs w:val="28"/>
+        </w:rPr>
+        <w:t> » sera utilisé pour être sûre d’utiliser bien les dépendances du projet et de faciliter son installation sur différentes machines.</w:t>
+      </w:r>
+    </w:p>
+    <w:p>
+      <w:pPr>
+        <w:rPr>
+          <w:sz w:val="28"/>
+          <w:szCs w:val="28"/>
+        </w:rPr>
+      </w:pPr>
+      <w:r>
+        <w:rPr>
+          <w:sz w:val="28"/>
+          <w:szCs w:val="28"/>
+        </w:rPr>
+        <w:t xml:space="preserve">Les dépendances seront regroupées dans un fichier « requirements.txt », pour également faciliter l’installation. </w:t>
+      </w:r>
+    </w:p>
+    <w:p>
+      <w:pPr>
+        <w:pStyle w:val="Sous-titre"/>
+        <w:rPr>
+          <w:sz w:val="36"/>
+          <w:szCs w:val="36"/>
+        </w:rPr>
+      </w:pPr>
+      <w:r>
+        <w:rPr>
+          <w:sz w:val="36"/>
+          <w:szCs w:val="36"/>
+        </w:rPr>
+        <w:t>4</w:t>
+      </w:r>
+      <w:r>
+        <w:rPr>
+          <w:sz w:val="36"/>
+          <w:szCs w:val="36"/>
+        </w:rPr>
+        <w:t xml:space="preserve">. </w:t>
+      </w:r>
+      <w:r>
+        <w:rPr>
+          <w:sz w:val="36"/>
+          <w:szCs w:val="36"/>
+        </w:rPr>
+        <w:t xml:space="preserve">Base de données </w:t>
+      </w:r>
+    </w:p>
+    <w:p>
+      <w:pPr>
+        <w:rPr>
+          <w:sz w:val="28"/>
+          <w:szCs w:val="28"/>
+        </w:rPr>
+      </w:pPr>
+      <w:r>
+        <w:rPr>
+          <w:sz w:val="28"/>
+          <w:szCs w:val="28"/>
+        </w:rPr>
+        <w:t xml:space="preserve">Pour ce projet nous utiliserons une base de données MySQL / </w:t>
+      </w:r>
+      <w:proofErr w:type="spellStart"/>
+      <w:r>
+        <w:rPr>
+          <w:sz w:val="28"/>
+          <w:szCs w:val="28"/>
+        </w:rPr>
+        <w:t>MariaDB</w:t>
+      </w:r>
+      <w:proofErr w:type="spellEnd"/>
+      <w:r>
+        <w:rPr>
+          <w:sz w:val="28"/>
+          <w:szCs w:val="28"/>
+        </w:rPr>
+        <w:t>.</w:t>
+      </w:r>
+    </w:p>
+    <w:p>
+      <w:pPr>
+        <w:rPr>
+          <w:sz w:val="28"/>
+          <w:szCs w:val="28"/>
+        </w:rPr>
+      </w:pPr>
+      <w:r>
+        <w:rPr>
+          <w:sz w:val="28"/>
+          <w:szCs w:val="28"/>
+        </w:rPr>
+        <w:t>La base de données aura pour but de stocker des informations contenant les déclenchements d’urgences des feux.</w:t>
+      </w:r>
+    </w:p>
+    <w:p>
+      <w:pPr>
+        <w:pStyle w:val="Sous-titre"/>
+        <w:rPr>
+          <w:sz w:val="36"/>
+          <w:szCs w:val="36"/>
+        </w:rPr>
+      </w:pPr>
+      <w:r>
+        <w:rPr>
+          <w:sz w:val="36"/>
+          <w:szCs w:val="36"/>
+        </w:rPr>
+        <w:t>5. Gestion du versioning</w:t>
+      </w:r>
+    </w:p>
+    <w:p>
+      <w:pPr>
+        <w:rPr>
+          <w:sz w:val="28"/>
+          <w:szCs w:val="28"/>
+        </w:rPr>
+      </w:pPr>
+      <w:r>
+        <w:rPr>
+          <w:sz w:val="28"/>
+          <w:szCs w:val="28"/>
+        </w:rPr>
+        <w:t xml:space="preserve">Pour le versioning </w:t>
+      </w:r>
+      <w:r>
+        <w:rPr>
+          <w:sz w:val="28"/>
+          <w:szCs w:val="28"/>
+        </w:rPr>
+        <w:t>le service retenu</w:t>
+      </w:r>
+      <w:r>
+        <w:rPr>
+          <w:sz w:val="28"/>
+          <w:szCs w:val="28"/>
+        </w:rPr>
+        <w:t xml:space="preserve"> es</w:t>
+      </w:r>
+      <w:r>
+        <w:rPr>
+          <w:sz w:val="28"/>
+          <w:szCs w:val="28"/>
+        </w:rPr>
+        <w:t xml:space="preserve">t Git et hébergé sur </w:t>
+      </w:r>
+      <w:proofErr w:type="spellStart"/>
+      <w:r>
+        <w:rPr>
+          <w:sz w:val="28"/>
+          <w:szCs w:val="28"/>
+        </w:rPr>
+        <w:t>Github</w:t>
+      </w:r>
+      <w:proofErr w:type="spellEnd"/>
+    </w:p>
+    <w:p>
+      <w:pPr>
+        <w:rPr>
+          <w:sz w:val="28"/>
+          <w:szCs w:val="28"/>
+        </w:rPr>
+      </w:pPr>
+      <w:hyperlink r:id="rId8" w:history="1">
+        <w:r>
+          <w:rPr>
+            <w:rStyle w:val="Lienhypertexte"/>
+            <w:sz w:val="28"/>
+            <w:szCs w:val="28"/>
+          </w:rPr>
+          <w:t>https://github.com/AlexKientz67/SAE-3.02</w:t>
+        </w:r>
+      </w:hyperlink>
+    </w:p>
+    <w:p>
+      <w:pPr>
+        <w:pStyle w:val="Sous-titre"/>
+        <w:rPr>
+          <w:sz w:val="36"/>
+          <w:szCs w:val="36"/>
+        </w:rPr>
+      </w:pPr>
+      <w:r>
+        <w:rPr>
+          <w:sz w:val="36"/>
+          <w:szCs w:val="36"/>
+        </w:rPr>
+        <w:t xml:space="preserve">6. Compatibilité </w:t>
+      </w:r>
+    </w:p>
+    <w:p>
+      <w:r>
+        <w:t>Le projet sera conçu pour être compatible avec les systèmes suivants :</w:t>
+      </w:r>
+    </w:p>
+    <w:p>
+      <w:pPr>
+        <w:pStyle w:val="Paragraphedeliste"/>
+        <w:numPr>
+          <w:ilvl w:val="0"/>
+          <w:numId w:val="8"/>
+        </w:numPr>
+      </w:pPr>
+      <w:r>
+        <w:t>Windows</w:t>
+      </w:r>
+    </w:p>
+    <w:p>
+      <w:pPr>
+        <w:pStyle w:val="Paragraphedeliste"/>
+        <w:numPr>
+          <w:ilvl w:val="0"/>
+          <w:numId w:val="8"/>
+        </w:numPr>
+      </w:pPr>
+      <w:r>
+        <w:t>Linux</w:t>
+      </w:r>
+    </w:p>
+    <w:p>
+      <w:pPr>
+        <w:pStyle w:val="Paragraphedeliste"/>
+        <w:numPr>
+          <w:ilvl w:val="0"/>
+          <w:numId w:val="8"/>
+        </w:numPr>
+      </w:pPr>
+      <w:proofErr w:type="spellStart"/>
+      <w:r>
+        <w:t>MacOS</w:t>
+      </w:r>
+      <w:proofErr w:type="spellEnd"/>
+    </w:p>
+    <w:p>
+      <w:r>
+        <w:br w:type="page"/>
+      </w:r>
+    </w:p>
+    <w:p>
+      <w:pPr>
+        <w:pStyle w:val="Titre"/>
+        <w:rPr>
+          <w:sz w:val="48"/>
+          <w:szCs w:val="48"/>
+        </w:rPr>
+      </w:pPr>
+      <w:r>
+        <w:rPr>
+          <w:sz w:val="48"/>
+          <w:szCs w:val="48"/>
+        </w:rPr>
+        <w:lastRenderedPageBreak/>
+        <w:t>3</w:t>
+      </w:r>
+      <w:r>
+        <w:rPr>
+          <w:sz w:val="48"/>
+          <w:szCs w:val="48"/>
+        </w:rPr>
+        <w:t xml:space="preserve">) </w:t>
+      </w:r>
+      <w:r>
+        <w:rPr>
+          <w:sz w:val="48"/>
+          <w:szCs w:val="48"/>
+        </w:rPr>
+        <w:t>Périmètre fonctionnel &amp; « Coût humain »</w:t>
+      </w:r>
+    </w:p>
+    <w:tbl>
+      <w:tblPr>
+        <w:tblStyle w:val="Grilledutableau"/>
+        <w:tblW w:w="9758" w:type="dxa"/>
+        <w:tblLook w:val="04A0" w:firstRow="1" w:lastRow="0" w:firstColumn="1" w:lastColumn="0" w:noHBand="0" w:noVBand="1"/>
+      </w:tblPr>
+      <w:tblGrid>
+        <w:gridCol w:w="2830"/>
+        <w:gridCol w:w="3402"/>
+        <w:gridCol w:w="1701"/>
+        <w:gridCol w:w="1825"/>
+      </w:tblGrid>
+      <w:tr>
+        <w:trPr>
+          <w:trHeight w:val="602"/>
+        </w:trPr>
+        <w:tc>
+          <w:tcPr>
+            <w:tcW w:w="2830" w:type="dxa"/>
+          </w:tcPr>
+          <w:p>
+            <w:pPr>
+              <w:rPr>
+                <w:sz w:val="28"/>
+                <w:szCs w:val="28"/>
+              </w:rPr>
+            </w:pPr>
+            <w:r>
+              <w:rPr>
+                <w:sz w:val="28"/>
+                <w:szCs w:val="28"/>
+              </w:rPr>
+              <w:t>Fonctionnalité</w:t>
+            </w:r>
+          </w:p>
+        </w:tc>
+        <w:tc>
+          <w:tcPr>
+            <w:tcW w:w="3402" w:type="dxa"/>
+          </w:tcPr>
+          <w:p>
+            <w:pPr>
+              <w:rPr>
+                <w:sz w:val="28"/>
+                <w:szCs w:val="28"/>
+              </w:rPr>
+            </w:pPr>
+            <w:r>
+              <w:rPr>
+                <w:sz w:val="28"/>
+                <w:szCs w:val="28"/>
+              </w:rPr>
+              <w:t>Priorité (</w:t>
+            </w:r>
+            <w:proofErr w:type="spellStart"/>
+            <w:r>
+              <w:rPr>
+                <w:sz w:val="28"/>
+                <w:szCs w:val="28"/>
+              </w:rPr>
+              <w:t>MoSCoW</w:t>
+            </w:r>
+            <w:proofErr w:type="spellEnd"/>
+            <w:r>
+              <w:rPr>
+                <w:sz w:val="28"/>
+                <w:szCs w:val="28"/>
+              </w:rPr>
+              <w:t>)</w:t>
+            </w:r>
+          </w:p>
+        </w:tc>
+        <w:tc>
+          <w:tcPr>
+            <w:tcW w:w="1701" w:type="dxa"/>
+          </w:tcPr>
+          <w:p>
+            <w:pPr>
+              <w:rPr>
+                <w:sz w:val="28"/>
+                <w:szCs w:val="28"/>
+              </w:rPr>
+            </w:pPr>
+            <w:r>
+              <w:rPr>
+                <w:sz w:val="28"/>
+                <w:szCs w:val="28"/>
+              </w:rPr>
+              <w:t>Complexité (1 à 5)</w:t>
+            </w:r>
+          </w:p>
+        </w:tc>
+        <w:tc>
+          <w:tcPr>
+            <w:tcW w:w="1825" w:type="dxa"/>
+          </w:tcPr>
+          <w:p>
+            <w:pPr>
+              <w:rPr>
+                <w:sz w:val="28"/>
+                <w:szCs w:val="28"/>
+              </w:rPr>
+            </w:pPr>
+            <w:r>
+              <w:rPr>
+                <w:sz w:val="28"/>
+                <w:szCs w:val="28"/>
+              </w:rPr>
+              <w:t>Coût humain estimé</w:t>
+            </w:r>
+          </w:p>
+        </w:tc>
+      </w:tr>
+      <w:tr>
+        <w:trPr>
+          <w:trHeight w:val="301"/>
+        </w:trPr>
+        <w:tc>
+          <w:tcPr>
+            <w:tcW w:w="2830" w:type="dxa"/>
+          </w:tcPr>
+          <w:p>
+            <w:pPr>
+              <w:rPr>
+                <w:sz w:val="28"/>
+                <w:szCs w:val="28"/>
+              </w:rPr>
+            </w:pPr>
+            <w:r>
+              <w:rPr>
+                <w:sz w:val="28"/>
+                <w:szCs w:val="28"/>
+              </w:rPr>
+              <w:t>Mise en place de la communication Client &lt; - &gt; Serveur</w:t>
+            </w:r>
+          </w:p>
+        </w:tc>
+        <w:tc>
+          <w:tcPr>
+            <w:tcW w:w="3402" w:type="dxa"/>
+          </w:tcPr>
+          <w:p>
+            <w:pPr>
+              <w:rPr>
+                <w:sz w:val="28"/>
+                <w:szCs w:val="28"/>
+              </w:rPr>
+            </w:pPr>
+            <w:r>
+              <w:rPr>
+                <w:sz w:val="28"/>
+                <w:szCs w:val="28"/>
+              </w:rPr>
+              <w:t>Must have</w:t>
+            </w:r>
+          </w:p>
+        </w:tc>
+        <w:tc>
+          <w:tcPr>
+            <w:tcW w:w="1701" w:type="dxa"/>
+          </w:tcPr>
+          <w:p>
+            <w:pPr>
+              <w:rPr>
+                <w:sz w:val="28"/>
+                <w:szCs w:val="28"/>
+              </w:rPr>
+            </w:pPr>
+            <w:r>
+              <w:rPr>
+                <w:sz w:val="28"/>
+                <w:szCs w:val="28"/>
+              </w:rPr>
+              <w:t>3</w:t>
+            </w:r>
+          </w:p>
+        </w:tc>
+        <w:tc>
+          <w:tcPr>
+            <w:tcW w:w="1825" w:type="dxa"/>
+          </w:tcPr>
+          <w:p>
+            <w:pPr>
+              <w:rPr>
+                <w:sz w:val="28"/>
+                <w:szCs w:val="28"/>
+              </w:rPr>
+            </w:pPr>
+            <w:r>
+              <w:rPr>
+                <w:sz w:val="28"/>
+                <w:szCs w:val="28"/>
+              </w:rPr>
+              <w:t>4 heures</w:t>
+            </w:r>
+          </w:p>
+        </w:tc>
+      </w:tr>
+      <w:tr>
+        <w:trPr>
+          <w:trHeight w:val="292"/>
+        </w:trPr>
+        <w:tc>
+          <w:tcPr>
+            <w:tcW w:w="2830" w:type="dxa"/>
+          </w:tcPr>
+          <w:p>
+            <w:pPr>
+              <w:rPr>
+                <w:sz w:val="28"/>
+                <w:szCs w:val="28"/>
+              </w:rPr>
+            </w:pPr>
+            <w:r>
+              <w:rPr>
+                <w:sz w:val="28"/>
+                <w:szCs w:val="28"/>
+              </w:rPr>
+              <w:t>Connexion et gestion du carrefour</w:t>
+            </w:r>
+          </w:p>
+        </w:tc>
+        <w:tc>
+          <w:tcPr>
+            <w:tcW w:w="3402" w:type="dxa"/>
+          </w:tcPr>
+          <w:p>
+            <w:pPr>
+              <w:rPr>
+                <w:sz w:val="28"/>
+                <w:szCs w:val="28"/>
+              </w:rPr>
+            </w:pPr>
+            <w:r>
+              <w:rPr>
+                <w:sz w:val="28"/>
+                <w:szCs w:val="28"/>
+              </w:rPr>
+              <w:t>Must have</w:t>
+            </w:r>
+          </w:p>
+        </w:tc>
+        <w:tc>
+          <w:tcPr>
+            <w:tcW w:w="1701" w:type="dxa"/>
+          </w:tcPr>
+          <w:p>
+            <w:pPr>
+              <w:rPr>
+                <w:sz w:val="28"/>
+                <w:szCs w:val="28"/>
+              </w:rPr>
+            </w:pPr>
+            <w:r>
+              <w:rPr>
+                <w:sz w:val="28"/>
+                <w:szCs w:val="28"/>
+              </w:rPr>
+              <w:t>3</w:t>
+            </w:r>
+          </w:p>
+        </w:tc>
+        <w:tc>
+          <w:tcPr>
+            <w:tcW w:w="1825" w:type="dxa"/>
+          </w:tcPr>
+          <w:p>
+            <w:pPr>
+              <w:rPr>
+                <w:sz w:val="28"/>
+                <w:szCs w:val="28"/>
+              </w:rPr>
+            </w:pPr>
+            <w:r>
+              <w:rPr>
+                <w:sz w:val="28"/>
+                <w:szCs w:val="28"/>
+              </w:rPr>
+              <w:t>2 heures</w:t>
+            </w:r>
+          </w:p>
+        </w:tc>
+      </w:tr>
+      <w:tr>
+        <w:trPr>
+          <w:trHeight w:val="301"/>
+        </w:trPr>
+        <w:tc>
+          <w:tcPr>
+            <w:tcW w:w="2830" w:type="dxa"/>
+          </w:tcPr>
+          <w:p>
+            <w:pPr>
+              <w:rPr>
+                <w:sz w:val="28"/>
+                <w:szCs w:val="28"/>
+              </w:rPr>
+            </w:pPr>
+            <w:r>
+              <w:rPr>
+                <w:sz w:val="28"/>
+                <w:szCs w:val="28"/>
+              </w:rPr>
+              <w:t>Connexion et gestion des véhicules d’urgences</w:t>
+            </w:r>
+          </w:p>
+        </w:tc>
+        <w:tc>
+          <w:tcPr>
+            <w:tcW w:w="3402" w:type="dxa"/>
+          </w:tcPr>
+          <w:p>
+            <w:pPr>
+              <w:rPr>
+                <w:sz w:val="28"/>
+                <w:szCs w:val="28"/>
+              </w:rPr>
+            </w:pPr>
+            <w:r>
+              <w:rPr>
+                <w:sz w:val="28"/>
+                <w:szCs w:val="28"/>
+              </w:rPr>
+              <w:t>Must Have</w:t>
+            </w:r>
+          </w:p>
+        </w:tc>
+        <w:tc>
+          <w:tcPr>
+            <w:tcW w:w="1701" w:type="dxa"/>
+          </w:tcPr>
+          <w:p>
+            <w:pPr>
+              <w:rPr>
+                <w:sz w:val="28"/>
+                <w:szCs w:val="28"/>
+              </w:rPr>
+            </w:pPr>
+            <w:r>
+              <w:rPr>
+                <w:sz w:val="28"/>
+                <w:szCs w:val="28"/>
+              </w:rPr>
+              <w:t>2</w:t>
+            </w:r>
+          </w:p>
+        </w:tc>
+        <w:tc>
+          <w:tcPr>
+            <w:tcW w:w="1825" w:type="dxa"/>
+          </w:tcPr>
+          <w:p>
+            <w:pPr>
+              <w:rPr>
+                <w:sz w:val="28"/>
+                <w:szCs w:val="28"/>
+              </w:rPr>
+            </w:pPr>
+            <w:r>
+              <w:rPr>
+                <w:sz w:val="28"/>
+                <w:szCs w:val="28"/>
+              </w:rPr>
+              <w:t>1 heures</w:t>
+            </w:r>
+          </w:p>
+        </w:tc>
+      </w:tr>
+      <w:tr>
+        <w:trPr>
+          <w:trHeight w:val="301"/>
+        </w:trPr>
+        <w:tc>
+          <w:tcPr>
+            <w:tcW w:w="2830" w:type="dxa"/>
+          </w:tcPr>
+          <w:p>
+            <w:pPr>
+              <w:rPr>
+                <w:sz w:val="28"/>
+                <w:szCs w:val="28"/>
+              </w:rPr>
+            </w:pPr>
+            <w:r>
+              <w:rPr>
+                <w:sz w:val="28"/>
+                <w:szCs w:val="28"/>
+              </w:rPr>
+              <w:t>Gestion des feux</w:t>
+            </w:r>
+          </w:p>
+        </w:tc>
+        <w:tc>
+          <w:tcPr>
+            <w:tcW w:w="3402" w:type="dxa"/>
+          </w:tcPr>
+          <w:p>
+            <w:pPr>
+              <w:rPr>
+                <w:sz w:val="28"/>
+                <w:szCs w:val="28"/>
+              </w:rPr>
+            </w:pPr>
+            <w:r>
+              <w:rPr>
+                <w:sz w:val="28"/>
+                <w:szCs w:val="28"/>
+              </w:rPr>
+              <w:t>Must Have</w:t>
+            </w:r>
+          </w:p>
+        </w:tc>
+        <w:tc>
+          <w:tcPr>
+            <w:tcW w:w="1701" w:type="dxa"/>
+          </w:tcPr>
+          <w:p>
+            <w:pPr>
+              <w:rPr>
+                <w:sz w:val="28"/>
+                <w:szCs w:val="28"/>
+              </w:rPr>
+            </w:pPr>
+            <w:r>
+              <w:rPr>
+                <w:sz w:val="28"/>
+                <w:szCs w:val="28"/>
+              </w:rPr>
+              <w:t>1</w:t>
+            </w:r>
+          </w:p>
+        </w:tc>
+        <w:tc>
+          <w:tcPr>
+            <w:tcW w:w="1825" w:type="dxa"/>
+          </w:tcPr>
+          <w:p>
+            <w:pPr>
+              <w:rPr>
+                <w:sz w:val="28"/>
+                <w:szCs w:val="28"/>
+              </w:rPr>
+            </w:pPr>
+            <w:r>
+              <w:rPr>
+                <w:sz w:val="28"/>
+                <w:szCs w:val="28"/>
+              </w:rPr>
+              <w:t>2 heures</w:t>
+            </w:r>
+          </w:p>
+        </w:tc>
+      </w:tr>
+      <w:tr>
+        <w:trPr>
+          <w:trHeight w:val="301"/>
+        </w:trPr>
+        <w:tc>
+          <w:tcPr>
+            <w:tcW w:w="2830" w:type="dxa"/>
+          </w:tcPr>
+          <w:p>
+            <w:pPr>
+              <w:rPr>
+                <w:sz w:val="28"/>
+                <w:szCs w:val="28"/>
+              </w:rPr>
+            </w:pPr>
+            <w:r>
+              <w:rPr>
+                <w:sz w:val="28"/>
+                <w:szCs w:val="28"/>
+              </w:rPr>
+              <w:t>Interface graphique du serveur</w:t>
+            </w:r>
+          </w:p>
+        </w:tc>
+        <w:tc>
+          <w:tcPr>
+            <w:tcW w:w="3402" w:type="dxa"/>
+          </w:tcPr>
+          <w:p>
+            <w:pPr>
+              <w:rPr>
+                <w:sz w:val="28"/>
+                <w:szCs w:val="28"/>
+              </w:rPr>
+            </w:pPr>
+            <w:r>
+              <w:rPr>
+                <w:sz w:val="28"/>
+                <w:szCs w:val="28"/>
+              </w:rPr>
+              <w:t>Must Have</w:t>
+            </w:r>
+          </w:p>
+        </w:tc>
+        <w:tc>
+          <w:tcPr>
+            <w:tcW w:w="1701" w:type="dxa"/>
+          </w:tcPr>
+          <w:p>
+            <w:pPr>
+              <w:rPr>
+                <w:sz w:val="28"/>
+                <w:szCs w:val="28"/>
+              </w:rPr>
+            </w:pPr>
+            <w:r>
+              <w:rPr>
+                <w:sz w:val="28"/>
+                <w:szCs w:val="28"/>
+              </w:rPr>
+              <w:t>3</w:t>
+            </w:r>
+          </w:p>
+        </w:tc>
+        <w:tc>
+          <w:tcPr>
+            <w:tcW w:w="1825" w:type="dxa"/>
+          </w:tcPr>
+          <w:p>
+            <w:pPr>
+              <w:rPr>
+                <w:sz w:val="28"/>
+                <w:szCs w:val="28"/>
+              </w:rPr>
+            </w:pPr>
+            <w:r>
+              <w:rPr>
+                <w:sz w:val="28"/>
+                <w:szCs w:val="28"/>
+              </w:rPr>
+              <w:t>4 heures</w:t>
+            </w:r>
+          </w:p>
+        </w:tc>
+      </w:tr>
+      <w:tr>
+        <w:trPr>
+          <w:trHeight w:val="301"/>
+        </w:trPr>
+        <w:tc>
+          <w:tcPr>
+            <w:tcW w:w="2830" w:type="dxa"/>
+          </w:tcPr>
+          <w:p>
+            <w:pPr>
+              <w:rPr>
+                <w:sz w:val="28"/>
+                <w:szCs w:val="28"/>
+              </w:rPr>
+            </w:pPr>
+            <w:r>
+              <w:rPr>
+                <w:sz w:val="28"/>
+                <w:szCs w:val="28"/>
+              </w:rPr>
+              <w:t>Interface graphique des clients</w:t>
+            </w:r>
+          </w:p>
+        </w:tc>
+        <w:tc>
+          <w:tcPr>
+            <w:tcW w:w="3402" w:type="dxa"/>
+          </w:tcPr>
+          <w:p>
+            <w:pPr>
+              <w:rPr>
+                <w:sz w:val="28"/>
+                <w:szCs w:val="28"/>
+              </w:rPr>
+            </w:pPr>
+            <w:r>
+              <w:rPr>
+                <w:sz w:val="28"/>
+                <w:szCs w:val="28"/>
+              </w:rPr>
+              <w:t>Must Have</w:t>
+            </w:r>
+          </w:p>
+        </w:tc>
+        <w:tc>
+          <w:tcPr>
+            <w:tcW w:w="1701" w:type="dxa"/>
+          </w:tcPr>
+          <w:p>
+            <w:pPr>
+              <w:rPr>
+                <w:sz w:val="28"/>
+                <w:szCs w:val="28"/>
+              </w:rPr>
+            </w:pPr>
+            <w:r>
+              <w:rPr>
+                <w:sz w:val="28"/>
+                <w:szCs w:val="28"/>
+              </w:rPr>
+              <w:t>3</w:t>
+            </w:r>
+          </w:p>
+        </w:tc>
+        <w:tc>
+          <w:tcPr>
+            <w:tcW w:w="1825" w:type="dxa"/>
+          </w:tcPr>
+          <w:p>
+            <w:pPr>
+              <w:rPr>
+                <w:sz w:val="28"/>
+                <w:szCs w:val="28"/>
+              </w:rPr>
+            </w:pPr>
+            <w:r>
+              <w:rPr>
+                <w:sz w:val="28"/>
+                <w:szCs w:val="28"/>
+              </w:rPr>
+              <w:t>4 heures</w:t>
+            </w:r>
+          </w:p>
+        </w:tc>
+      </w:tr>
+      <w:tr>
+        <w:trPr>
+          <w:trHeight w:val="301"/>
+        </w:trPr>
+        <w:tc>
+          <w:tcPr>
+            <w:tcW w:w="2830" w:type="dxa"/>
+          </w:tcPr>
+          <w:p>
+            <w:pPr>
+              <w:rPr>
+                <w:sz w:val="28"/>
+                <w:szCs w:val="28"/>
+              </w:rPr>
+            </w:pPr>
+            <w:r>
+              <w:rPr>
+                <w:sz w:val="28"/>
+                <w:szCs w:val="28"/>
+              </w:rPr>
+              <w:t xml:space="preserve">Journalisation des évènements </w:t>
+            </w:r>
+          </w:p>
+        </w:tc>
+        <w:tc>
+          <w:tcPr>
+            <w:tcW w:w="3402" w:type="dxa"/>
+          </w:tcPr>
+          <w:p>
+            <w:pPr>
+              <w:rPr>
+                <w:sz w:val="28"/>
+                <w:szCs w:val="28"/>
+              </w:rPr>
+            </w:pPr>
+            <w:proofErr w:type="spellStart"/>
+            <w:r>
+              <w:rPr>
+                <w:sz w:val="28"/>
+                <w:szCs w:val="28"/>
+              </w:rPr>
+              <w:t>Should</w:t>
+            </w:r>
+            <w:proofErr w:type="spellEnd"/>
+            <w:r>
+              <w:rPr>
+                <w:sz w:val="28"/>
+                <w:szCs w:val="28"/>
+              </w:rPr>
+              <w:t xml:space="preserve"> </w:t>
+            </w:r>
+            <w:r>
+              <w:rPr>
+                <w:sz w:val="28"/>
+                <w:szCs w:val="28"/>
+              </w:rPr>
+              <w:t>Have</w:t>
+            </w:r>
+          </w:p>
+        </w:tc>
+        <w:tc>
+          <w:tcPr>
+            <w:tcW w:w="1701" w:type="dxa"/>
+          </w:tcPr>
+          <w:p>
+            <w:pPr>
+              <w:rPr>
+                <w:sz w:val="28"/>
+                <w:szCs w:val="28"/>
+              </w:rPr>
+            </w:pPr>
+            <w:r>
+              <w:rPr>
+                <w:sz w:val="28"/>
+                <w:szCs w:val="28"/>
+              </w:rPr>
+              <w:t>2</w:t>
+            </w:r>
+          </w:p>
+        </w:tc>
+        <w:tc>
+          <w:tcPr>
+            <w:tcW w:w="1825" w:type="dxa"/>
+          </w:tcPr>
+          <w:p>
+            <w:pPr>
+              <w:rPr>
+                <w:sz w:val="28"/>
+                <w:szCs w:val="28"/>
+              </w:rPr>
+            </w:pPr>
+            <w:r>
+              <w:rPr>
+                <w:sz w:val="28"/>
+                <w:szCs w:val="28"/>
+              </w:rPr>
+              <w:t xml:space="preserve">4 heures </w:t>
+            </w:r>
+          </w:p>
+        </w:tc>
+      </w:tr>
+      <w:tr>
+        <w:trPr>
+          <w:trHeight w:val="301"/>
+        </w:trPr>
+        <w:tc>
+          <w:tcPr>
+            <w:tcW w:w="2830" w:type="dxa"/>
+          </w:tcPr>
+          <w:p>
+            <w:pPr>
+              <w:rPr>
+                <w:sz w:val="28"/>
+                <w:szCs w:val="28"/>
+              </w:rPr>
+            </w:pPr>
+            <w:r>
+              <w:rPr>
+                <w:sz w:val="28"/>
+                <w:szCs w:val="28"/>
+              </w:rPr>
+              <w:t>Simulation des véhicules usagers</w:t>
+            </w:r>
+          </w:p>
+        </w:tc>
+        <w:tc>
+          <w:tcPr>
+            <w:tcW w:w="3402" w:type="dxa"/>
+          </w:tcPr>
+          <w:p>
+            <w:pPr>
+              <w:rPr>
+                <w:sz w:val="28"/>
+                <w:szCs w:val="28"/>
+              </w:rPr>
+            </w:pPr>
+            <w:proofErr w:type="spellStart"/>
+            <w:r>
+              <w:rPr>
+                <w:sz w:val="28"/>
+                <w:szCs w:val="28"/>
+              </w:rPr>
+              <w:t>Could</w:t>
+            </w:r>
+            <w:proofErr w:type="spellEnd"/>
+            <w:r>
+              <w:rPr>
+                <w:sz w:val="28"/>
+                <w:szCs w:val="28"/>
+              </w:rPr>
+              <w:t xml:space="preserve"> Have</w:t>
+            </w:r>
+          </w:p>
+        </w:tc>
+        <w:tc>
+          <w:tcPr>
+            <w:tcW w:w="1701" w:type="dxa"/>
+          </w:tcPr>
+          <w:p>
+            <w:pPr>
+              <w:rPr>
+                <w:sz w:val="28"/>
+                <w:szCs w:val="28"/>
+              </w:rPr>
+            </w:pPr>
+            <w:r>
+              <w:rPr>
+                <w:sz w:val="28"/>
+                <w:szCs w:val="28"/>
+              </w:rPr>
+              <w:t>5</w:t>
+            </w:r>
+          </w:p>
+        </w:tc>
+        <w:tc>
+          <w:tcPr>
+            <w:tcW w:w="1825" w:type="dxa"/>
+          </w:tcPr>
+          <w:p>
+            <w:pPr>
+              <w:rPr>
+                <w:sz w:val="28"/>
+                <w:szCs w:val="28"/>
+              </w:rPr>
+            </w:pPr>
+            <w:r>
+              <w:rPr>
+                <w:sz w:val="28"/>
+                <w:szCs w:val="28"/>
+              </w:rPr>
+              <w:t>5 heures</w:t>
+            </w:r>
+          </w:p>
+        </w:tc>
+      </w:tr>
+      <w:tr>
+        <w:trPr>
+          <w:trHeight w:val="301"/>
+        </w:trPr>
+        <w:tc>
+          <w:tcPr>
+            <w:tcW w:w="2830" w:type="dxa"/>
+          </w:tcPr>
+          <w:p>
+            <w:pPr>
+              <w:rPr>
+                <w:sz w:val="28"/>
+                <w:szCs w:val="28"/>
+              </w:rPr>
+            </w:pPr>
+            <w:r>
+              <w:rPr>
+                <w:sz w:val="28"/>
+                <w:szCs w:val="28"/>
+              </w:rPr>
+              <w:t>Documentations Technique</w:t>
+            </w:r>
+          </w:p>
+        </w:tc>
+        <w:tc>
+          <w:tcPr>
+            <w:tcW w:w="3402" w:type="dxa"/>
+          </w:tcPr>
+          <w:p>
+            <w:pPr>
+              <w:rPr>
+                <w:sz w:val="28"/>
+                <w:szCs w:val="28"/>
+              </w:rPr>
+            </w:pPr>
+            <w:r>
+              <w:rPr>
+                <w:sz w:val="28"/>
+                <w:szCs w:val="28"/>
+              </w:rPr>
+              <w:t>Must Have</w:t>
+            </w:r>
+          </w:p>
+        </w:tc>
+        <w:tc>
+          <w:tcPr>
+            <w:tcW w:w="1701" w:type="dxa"/>
+          </w:tcPr>
+          <w:p>
+            <w:pPr>
+              <w:rPr>
+                <w:sz w:val="28"/>
+                <w:szCs w:val="28"/>
+              </w:rPr>
+            </w:pPr>
+            <w:r>
+              <w:rPr>
+                <w:sz w:val="28"/>
+                <w:szCs w:val="28"/>
+              </w:rPr>
+              <w:t>2</w:t>
+            </w:r>
+          </w:p>
+        </w:tc>
+        <w:tc>
+          <w:tcPr>
+            <w:tcW w:w="1825" w:type="dxa"/>
+          </w:tcPr>
+          <w:p>
+            <w:pPr>
+              <w:rPr>
+                <w:sz w:val="28"/>
+                <w:szCs w:val="28"/>
+              </w:rPr>
+            </w:pPr>
+            <w:r>
+              <w:rPr>
+                <w:sz w:val="28"/>
+                <w:szCs w:val="28"/>
+              </w:rPr>
+              <w:t>2 heures</w:t>
+            </w:r>
+          </w:p>
+        </w:tc>
+      </w:tr>
+    </w:tbl>
     <w:p/>
     <w:p>
       <w:pPr>
+        <w:rPr>
+          <w:rFonts w:asciiTheme="majorHAnsi" w:eastAsiaTheme="majorEastAsia" w:hAnsiTheme="majorHAnsi" w:cstheme="majorBidi"/>
+          <w:spacing w:val="-10"/>
+          <w:kern w:val="28"/>
+          <w:sz w:val="56"/>
+          <w:szCs w:val="56"/>
+        </w:rPr>
+      </w:pPr>
+      <w:r>
+        <w:br w:type="page"/>
+      </w:r>
+    </w:p>
+    <w:p>
+      <w:pPr>
         <w:pStyle w:val="Titre"/>
-      </w:pPr>
+        <w:rPr>
+          <w:sz w:val="48"/>
+          <w:szCs w:val="48"/>
+        </w:rPr>
+      </w:pPr>
+      <w:r>
+        <w:rPr>
+          <w:sz w:val="48"/>
+          <w:szCs w:val="48"/>
+        </w:rPr>
+        <w:lastRenderedPageBreak/>
+        <w:t>4) Planning et livrables</w:t>
+      </w:r>
+    </w:p>
+    <w:p>
+      <w:pPr>
+        <w:rPr>
+          <w:sz w:val="28"/>
+          <w:szCs w:val="28"/>
+        </w:rPr>
+      </w:pPr>
+      <w:r>
+        <w:rPr>
+          <w:sz w:val="28"/>
+          <w:szCs w:val="28"/>
+        </w:rPr>
+        <w:tab/>
+      </w:r>
     </w:p>
     <w:sectPr>
       <w:pgSz w:w="11906" w:h="16838"/>
@@ -938,6 +2565,119 @@
     </w:lvl>
   </w:abstractNum>
   <w:abstractNum w:abstractNumId="2" w15:restartNumberingAfterBreak="0">
+    <w:nsid w:val="16F55BA8"/>
+    <w:multiLevelType w:val="hybridMultilevel"/>
+    <w:tmpl w:val="E898C8FA"/>
+    <w:lvl w:ilvl="0" w:tplc="C768742A">
+      <w:start w:val="2"/>
+      <w:numFmt w:val="bullet"/>
+      <w:lvlText w:val="-"/>
+      <w:lvlJc w:val="left"/>
+      <w:pPr>
+        <w:ind w:left="720" w:hanging="360"/>
+      </w:pPr>
+      <w:rPr>
+        <w:rFonts w:ascii="Aptos" w:eastAsiaTheme="minorHAnsi" w:hAnsi="Aptos" w:cstheme="minorBidi" w:hint="default"/>
+      </w:rPr>
+    </w:lvl>
+    <w:lvl w:ilvl="1" w:tplc="040C0003">
+      <w:start w:val="1"/>
+      <w:numFmt w:val="bullet"/>
+      <w:lvlText w:val="o"/>
+      <w:lvlJc w:val="left"/>
+      <w:pPr>
+        <w:ind w:left="1440" w:hanging="360"/>
+      </w:pPr>
+      <w:rPr>
+        <w:rFonts w:ascii="Courier New" w:hAnsi="Courier New" w:cs="Courier New" w:hint="default"/>
+      </w:rPr>
+    </w:lvl>
+    <w:lvl w:ilvl="2" w:tplc="040C0005" w:tentative="1">
+      <w:start w:val="1"/>
+      <w:numFmt w:val="bullet"/>
+      <w:lvlText w:val=""/>
+      <w:lvlJc w:val="left"/>
+      <w:pPr>
+        <w:ind w:left="2160" w:hanging="360"/>
+      </w:pPr>
+      <w:rPr>
+        <w:rFonts w:ascii="Wingdings" w:hAnsi="Wingdings" w:hint="default"/>
+      </w:rPr>
+    </w:lvl>
+    <w:lvl w:ilvl="3" w:tplc="040C0001" w:tentative="1">
+      <w:start w:val="1"/>
+      <w:numFmt w:val="bullet"/>
+      <w:lvlText w:val=""/>
+      <w:lvlJc w:val="left"/>
+      <w:pPr>
+        <w:ind w:left="2880" w:hanging="360"/>
+      </w:pPr>
+      <w:rPr>
+        <w:rFonts w:ascii="Symbol" w:hAnsi="Symbol" w:hint="default"/>
+      </w:rPr>
+    </w:lvl>
+    <w:lvl w:ilvl="4" w:tplc="040C0003" w:tentative="1">
+      <w:start w:val="1"/>
+      <w:numFmt w:val="bullet"/>
+      <w:lvlText w:val="o"/>
+      <w:lvlJc w:val="left"/>
+      <w:pPr>
+        <w:ind w:left="3600" w:hanging="360"/>
+      </w:pPr>
+      <w:rPr>
+        <w:rFonts w:ascii="Courier New" w:hAnsi="Courier New" w:cs="Courier New" w:hint="default"/>
+      </w:rPr>
+    </w:lvl>
+    <w:lvl w:ilvl="5" w:tplc="040C0005" w:tentative="1">
+      <w:start w:val="1"/>
+      <w:numFmt w:val="bullet"/>
+      <w:lvlText w:val=""/>
+      <w:lvlJc w:val="left"/>
+      <w:pPr>
+        <w:ind w:left="4320" w:hanging="360"/>
+      </w:pPr>
+      <w:rPr>
+        <w:rFonts w:ascii="Wingdings" w:hAnsi="Wingdings" w:hint="default"/>
+      </w:rPr>
+    </w:lvl>
+    <w:lvl w:ilvl="6" w:tplc="040C0001" w:tentative="1">
+      <w:start w:val="1"/>
+      <w:numFmt w:val="bullet"/>
+      <w:lvlText w:val=""/>
+      <w:lvlJc w:val="left"/>
+      <w:pPr>
+        <w:ind w:left="5040" w:hanging="360"/>
+      </w:pPr>
+      <w:rPr>
+        <w:rFonts w:ascii="Symbol" w:hAnsi="Symbol" w:hint="default"/>
+      </w:rPr>
+    </w:lvl>
+    <w:lvl w:ilvl="7" w:tplc="040C0003" w:tentative="1">
+      <w:start w:val="1"/>
+      <w:numFmt w:val="bullet"/>
+      <w:lvlText w:val="o"/>
+      <w:lvlJc w:val="left"/>
+      <w:pPr>
+        <w:ind w:left="5760" w:hanging="360"/>
+      </w:pPr>
+      <w:rPr>
+        <w:rFonts w:ascii="Courier New" w:hAnsi="Courier New" w:cs="Courier New" w:hint="default"/>
+      </w:rPr>
+    </w:lvl>
+    <w:lvl w:ilvl="8" w:tplc="040C0005" w:tentative="1">
+      <w:start w:val="1"/>
+      <w:numFmt w:val="bullet"/>
+      <w:lvlText w:val=""/>
+      <w:lvlJc w:val="left"/>
+      <w:pPr>
+        <w:ind w:left="6480" w:hanging="360"/>
+      </w:pPr>
+      <w:rPr>
+        <w:rFonts w:ascii="Wingdings" w:hAnsi="Wingdings" w:hint="default"/>
+      </w:rPr>
+    </w:lvl>
+  </w:abstractNum>
+  <w:abstractNum w:abstractNumId="3" w15:restartNumberingAfterBreak="0">
     <w:nsid w:val="1D574D78"/>
     <w:multiLevelType w:val="hybridMultilevel"/>
     <w:tmpl w:val="DFE26F6A"/>
@@ -1026,7 +2766,7 @@
       </w:pPr>
     </w:lvl>
   </w:abstractNum>
-  <w:abstractNum w:abstractNumId="3" w15:restartNumberingAfterBreak="0">
+  <w:abstractNum w:abstractNumId="4" w15:restartNumberingAfterBreak="0">
     <w:nsid w:val="1E2944E4"/>
     <w:multiLevelType w:val="hybridMultilevel"/>
     <w:tmpl w:val="5F7EECEC"/>
@@ -1115,7 +2855,7 @@
       </w:pPr>
     </w:lvl>
   </w:abstractNum>
-  <w:abstractNum w:abstractNumId="4" w15:restartNumberingAfterBreak="0">
+  <w:abstractNum w:abstractNumId="5" w15:restartNumberingAfterBreak="0">
     <w:nsid w:val="3D5472C0"/>
     <w:multiLevelType w:val="hybridMultilevel"/>
     <w:tmpl w:val="7366A89A"/>
@@ -1204,7 +2944,120 @@
       </w:pPr>
     </w:lvl>
   </w:abstractNum>
-  <w:abstractNum w:abstractNumId="5" w15:restartNumberingAfterBreak="0">
+  <w:abstractNum w:abstractNumId="6" w15:restartNumberingAfterBreak="0">
+    <w:nsid w:val="79AD27F7"/>
+    <w:multiLevelType w:val="hybridMultilevel"/>
+    <w:tmpl w:val="5908FB12"/>
+    <w:lvl w:ilvl="0" w:tplc="425C5690">
+      <w:start w:val="2"/>
+      <w:numFmt w:val="bullet"/>
+      <w:lvlText w:val="-"/>
+      <w:lvlJc w:val="left"/>
+      <w:pPr>
+        <w:ind w:left="720" w:hanging="360"/>
+      </w:pPr>
+      <w:rPr>
+        <w:rFonts w:ascii="Aptos" w:eastAsiaTheme="minorHAnsi" w:hAnsi="Aptos" w:cstheme="minorBidi" w:hint="default"/>
+      </w:rPr>
+    </w:lvl>
+    <w:lvl w:ilvl="1" w:tplc="040C0003">
+      <w:start w:val="1"/>
+      <w:numFmt w:val="bullet"/>
+      <w:lvlText w:val="o"/>
+      <w:lvlJc w:val="left"/>
+      <w:pPr>
+        <w:ind w:left="1440" w:hanging="360"/>
+      </w:pPr>
+      <w:rPr>
+        <w:rFonts w:ascii="Courier New" w:hAnsi="Courier New" w:cs="Courier New" w:hint="default"/>
+      </w:rPr>
+    </w:lvl>
+    <w:lvl w:ilvl="2" w:tplc="040C0005" w:tentative="1">
+      <w:start w:val="1"/>
+      <w:numFmt w:val="bullet"/>
+      <w:lvlText w:val=""/>
+      <w:lvlJc w:val="left"/>
+      <w:pPr>
+        <w:ind w:left="2160" w:hanging="360"/>
+      </w:pPr>
+      <w:rPr>
+        <w:rFonts w:ascii="Wingdings" w:hAnsi="Wingdings" w:hint="default"/>
+      </w:rPr>
+    </w:lvl>
+    <w:lvl w:ilvl="3" w:tplc="040C0001" w:tentative="1">
+      <w:start w:val="1"/>
+      <w:numFmt w:val="bullet"/>
+      <w:lvlText w:val=""/>
+      <w:lvlJc w:val="left"/>
+      <w:pPr>
+        <w:ind w:left="2880" w:hanging="360"/>
+      </w:pPr>
+      <w:rPr>
+        <w:rFonts w:ascii="Symbol" w:hAnsi="Symbol" w:hint="default"/>
+      </w:rPr>
+    </w:lvl>
+    <w:lvl w:ilvl="4" w:tplc="040C0003" w:tentative="1">
+      <w:start w:val="1"/>
+      <w:numFmt w:val="bullet"/>
+      <w:lvlText w:val="o"/>
+      <w:lvlJc w:val="left"/>
+      <w:pPr>
+        <w:ind w:left="3600" w:hanging="360"/>
+      </w:pPr>
+      <w:rPr>
+        <w:rFonts w:ascii="Courier New" w:hAnsi="Courier New" w:cs="Courier New" w:hint="default"/>
+      </w:rPr>
+    </w:lvl>
+    <w:lvl w:ilvl="5" w:tplc="040C0005" w:tentative="1">
+      <w:start w:val="1"/>
+      <w:numFmt w:val="bullet"/>
+      <w:lvlText w:val=""/>
+      <w:lvlJc w:val="left"/>
+      <w:pPr>
+        <w:ind w:left="4320" w:hanging="360"/>
+      </w:pPr>
+      <w:rPr>
+        <w:rFonts w:ascii="Wingdings" w:hAnsi="Wingdings" w:hint="default"/>
+      </w:rPr>
+    </w:lvl>
+    <w:lvl w:ilvl="6" w:tplc="040C0001" w:tentative="1">
+      <w:start w:val="1"/>
+      <w:numFmt w:val="bullet"/>
+      <w:lvlText w:val=""/>
+      <w:lvlJc w:val="left"/>
+      <w:pPr>
+        <w:ind w:left="5040" w:hanging="360"/>
+      </w:pPr>
+      <w:rPr>
+        <w:rFonts w:ascii="Symbol" w:hAnsi="Symbol" w:hint="default"/>
+      </w:rPr>
+    </w:lvl>
+    <w:lvl w:ilvl="7" w:tplc="040C0003" w:tentative="1">
+      <w:start w:val="1"/>
+      <w:numFmt w:val="bullet"/>
+      <w:lvlText w:val="o"/>
+      <w:lvlJc w:val="left"/>
+      <w:pPr>
+        <w:ind w:left="5760" w:hanging="360"/>
+      </w:pPr>
+      <w:rPr>
+        <w:rFonts w:ascii="Courier New" w:hAnsi="Courier New" w:cs="Courier New" w:hint="default"/>
+      </w:rPr>
+    </w:lvl>
+    <w:lvl w:ilvl="8" w:tplc="040C0005" w:tentative="1">
+      <w:start w:val="1"/>
+      <w:numFmt w:val="bullet"/>
+      <w:lvlText w:val=""/>
+      <w:lvlJc w:val="left"/>
+      <w:pPr>
+        <w:ind w:left="6480" w:hanging="360"/>
+      </w:pPr>
+      <w:rPr>
+        <w:rFonts w:ascii="Wingdings" w:hAnsi="Wingdings" w:hint="default"/>
+      </w:rPr>
+    </w:lvl>
+  </w:abstractNum>
+  <w:abstractNum w:abstractNumId="7" w15:restartNumberingAfterBreak="0">
     <w:nsid w:val="7AAA1104"/>
     <w:multiLevelType w:val="hybridMultilevel"/>
     <w:tmpl w:val="D4F69FB8"/>
@@ -1294,22 +3147,28 @@
     </w:lvl>
   </w:abstractNum>
   <w:num w:numId="1" w16cid:durableId="283388173">
-    <w:abstractNumId w:val="3"/>
+    <w:abstractNumId w:val="4"/>
   </w:num>
   <w:num w:numId="2" w16cid:durableId="397555118">
     <w:abstractNumId w:val="0"/>
   </w:num>
   <w:num w:numId="3" w16cid:durableId="770904103">
-    <w:abstractNumId w:val="5"/>
+    <w:abstractNumId w:val="7"/>
   </w:num>
   <w:num w:numId="4" w16cid:durableId="1238444407">
-    <w:abstractNumId w:val="2"/>
+    <w:abstractNumId w:val="3"/>
   </w:num>
   <w:num w:numId="5" w16cid:durableId="100078260">
     <w:abstractNumId w:val="1"/>
   </w:num>
   <w:num w:numId="6" w16cid:durableId="1539663009">
-    <w:abstractNumId w:val="4"/>
+    <w:abstractNumId w:val="5"/>
+  </w:num>
+  <w:num w:numId="7" w16cid:durableId="475027775">
+    <w:abstractNumId w:val="6"/>
+  </w:num>
+  <w:num w:numId="8" w16cid:durableId="969944365">
+    <w:abstractNumId w:val="2"/>
   </w:num>
 </w:numbering>
 </file>
@@ -2273,6 +4132,59 @@
     <w:uiPriority w:val="99"/>
     <w:rsid w:val="002C0CA0"/>
   </w:style>
+  <w:style w:type="character" w:styleId="Lienhypertexte">
+    <w:name w:val="Hyperlink"/>
+    <w:basedOn w:val="Policepardfaut"/>
+    <w:uiPriority w:val="99"/>
+    <w:unhideWhenUsed/>
+    <w:rsid w:val="003D2617"/>
+    <w:rPr>
+      <w:color w:val="467886" w:themeColor="hyperlink"/>
+      <w:u w:val="single"/>
+    </w:rPr>
+  </w:style>
+  <w:style w:type="character" w:styleId="Mentionnonrsolue">
+    <w:name w:val="Unresolved Mention"/>
+    <w:basedOn w:val="Policepardfaut"/>
+    <w:uiPriority w:val="99"/>
+    <w:semiHidden/>
+    <w:unhideWhenUsed/>
+    <w:rsid w:val="003D2617"/>
+    <w:rPr>
+      <w:color w:val="605E5C"/>
+      <w:shd w:val="clear" w:color="auto" w:fill="E1DFDD"/>
+    </w:rPr>
+  </w:style>
+  <w:style w:type="character" w:styleId="lev">
+    <w:name w:val="Strong"/>
+    <w:basedOn w:val="Policepardfaut"/>
+    <w:uiPriority w:val="22"/>
+    <w:qFormat/>
+    <w:rsid w:val="003D2617"/>
+    <w:rPr>
+      <w:b/>
+      <w:bCs/>
+    </w:rPr>
+  </w:style>
+  <w:style w:type="table" w:styleId="Grilledutableau">
+    <w:name w:val="Table Grid"/>
+    <w:basedOn w:val="TableauNormal"/>
+    <w:uiPriority w:val="39"/>
+    <w:rsid w:val="00A77544"/>
+    <w:pPr>
+      <w:spacing w:after="0" w:line="240" w:lineRule="auto"/>
+    </w:pPr>
+    <w:tblPr>
+      <w:tblBorders>
+        <w:top w:val="single" w:sz="4" w:space="0" w:color="auto"/>
+        <w:left w:val="single" w:sz="4" w:space="0" w:color="auto"/>
+        <w:bottom w:val="single" w:sz="4" w:space="0" w:color="auto"/>
+        <w:right w:val="single" w:sz="4" w:space="0" w:color="auto"/>
+        <w:insideH w:val="single" w:sz="4" w:space="0" w:color="auto"/>
+        <w:insideV w:val="single" w:sz="4" w:space="0" w:color="auto"/>
+      </w:tblBorders>
+    </w:tblPr>
+  </w:style>
 </w:styles>
 </file>
 

</xml_diff>